<commit_message>
Informe: enlace al repositorio en el Apendice A
</commit_message>
<xml_diff>
--- a/docs/Gonzalez_Jesus_Analizando_EA1.docx
+++ b/docs/Gonzalez_Jesus_Analizando_EA1.docx
@@ -143,6 +143,7 @@
           <w:noProof/>
           <w:kern w:val="2"/>
           <w:szCs w:val="24"/>
+          <w:lang w:val="en-US"/>
           <w14:ligatures w14:val="standardContextual"/>
         </w:rPr>
       </w:pPr>
@@ -155,12 +156,13 @@
       <w:r>
         <w:fldChar w:fldCharType="separate"/>
       </w:r>
-      <w:hyperlink w:anchor="_Toc243330788" w:history="1">
+      <w:hyperlink w:anchor="_Toc243332162" w:history="1">
         <w:r>
           <w:rPr>
             <w:rStyle w:val="Hyperlink"/>
             <w:noProof/>
             <w:color w:val="000000"/>
+            <w:lang w:val="es-ES"/>
           </w:rPr>
           <w:t>1. Introducción y planteamiento del problema</w:t>
         </w:r>
@@ -183,7 +185,7 @@
             <w:noProof/>
             <w:webHidden/>
           </w:rPr>
-          <w:instrText xml:space="preserve"> PAGEREF _Toc243330788 \h </w:instrText>
+          <w:instrText xml:space="preserve"> PAGEREF _Toc243332162 \h </w:instrText>
         </w:r>
         <w:r>
           <w:rPr>
@@ -226,15 +228,17 @@
           <w:noProof/>
           <w:kern w:val="2"/>
           <w:szCs w:val="24"/>
+          <w:lang w:val="en-US"/>
           <w14:ligatures w14:val="standardContextual"/>
         </w:rPr>
       </w:pPr>
-      <w:hyperlink w:anchor="_Toc243330789" w:history="1">
+      <w:hyperlink w:anchor="_Toc243332163" w:history="1">
         <w:r>
           <w:rPr>
             <w:rStyle w:val="Hyperlink"/>
             <w:noProof/>
             <w:color w:val="000000"/>
+            <w:lang w:val="es-ES"/>
           </w:rPr>
           <w:t>1.1 Los tres métodos como respuesta al problema</w:t>
         </w:r>
@@ -257,7 +261,7 @@
             <w:noProof/>
             <w:webHidden/>
           </w:rPr>
-          <w:instrText xml:space="preserve"> PAGEREF _Toc243330789 \h </w:instrText>
+          <w:instrText xml:space="preserve"> PAGEREF _Toc243332163 \h </w:instrText>
         </w:r>
         <w:r>
           <w:rPr>
@@ -277,7 +281,7 @@
             <w:noProof/>
             <w:webHidden/>
           </w:rPr>
-          <w:t>4</w:t>
+          <w:t>5</w:t>
         </w:r>
         <w:r>
           <w:rPr>
@@ -300,15 +304,17 @@
           <w:noProof/>
           <w:kern w:val="2"/>
           <w:szCs w:val="24"/>
+          <w:lang w:val="en-US"/>
           <w14:ligatures w14:val="standardContextual"/>
         </w:rPr>
       </w:pPr>
-      <w:hyperlink w:anchor="_Toc243330790" w:history="1">
+      <w:hyperlink w:anchor="_Toc243332164" w:history="1">
         <w:r>
           <w:rPr>
             <w:rStyle w:val="Hyperlink"/>
             <w:noProof/>
             <w:color w:val="000000"/>
+            <w:lang w:val="es-ES"/>
           </w:rPr>
           <w:t>2. Descripción de la página y del artículo a analizar</w:t>
         </w:r>
@@ -331,7 +337,7 @@
             <w:noProof/>
             <w:webHidden/>
           </w:rPr>
-          <w:instrText xml:space="preserve"> PAGEREF _Toc243330790 \h </w:instrText>
+          <w:instrText xml:space="preserve"> PAGEREF _Toc243332164 \h </w:instrText>
         </w:r>
         <w:r>
           <w:rPr>
@@ -351,7 +357,7 @@
             <w:noProof/>
             <w:webHidden/>
           </w:rPr>
-          <w:t>5</w:t>
+          <w:t>6</w:t>
         </w:r>
         <w:r>
           <w:rPr>
@@ -374,15 +380,17 @@
           <w:noProof/>
           <w:kern w:val="2"/>
           <w:szCs w:val="24"/>
+          <w:lang w:val="en-US"/>
           <w14:ligatures w14:val="standardContextual"/>
         </w:rPr>
       </w:pPr>
-      <w:hyperlink w:anchor="_Toc243330791" w:history="1">
+      <w:hyperlink w:anchor="_Toc243332165" w:history="1">
         <w:r>
           <w:rPr>
             <w:rStyle w:val="Hyperlink"/>
             <w:noProof/>
             <w:color w:val="000000"/>
+            <w:lang w:val="es-ES"/>
           </w:rPr>
           <w:t>2.1 La página</w:t>
         </w:r>
@@ -405,7 +413,7 @@
             <w:noProof/>
             <w:webHidden/>
           </w:rPr>
-          <w:instrText xml:space="preserve"> PAGEREF _Toc243330791 \h </w:instrText>
+          <w:instrText xml:space="preserve"> PAGEREF _Toc243332165 \h </w:instrText>
         </w:r>
         <w:r>
           <w:rPr>
@@ -425,7 +433,7 @@
             <w:noProof/>
             <w:webHidden/>
           </w:rPr>
-          <w:t>5</w:t>
+          <w:t>6</w:t>
         </w:r>
         <w:r>
           <w:rPr>
@@ -448,15 +456,17 @@
           <w:noProof/>
           <w:kern w:val="2"/>
           <w:szCs w:val="24"/>
+          <w:lang w:val="en-US"/>
           <w14:ligatures w14:val="standardContextual"/>
         </w:rPr>
       </w:pPr>
-      <w:hyperlink w:anchor="_Toc243330792" w:history="1">
+      <w:hyperlink w:anchor="_Toc243332166" w:history="1">
         <w:r>
           <w:rPr>
             <w:rStyle w:val="Hyperlink"/>
             <w:noProof/>
             <w:color w:val="000000"/>
+            <w:lang w:val="es-ES"/>
           </w:rPr>
           <w:t>2.2 El artículo</w:t>
         </w:r>
@@ -479,7 +489,7 @@
             <w:noProof/>
             <w:webHidden/>
           </w:rPr>
-          <w:instrText xml:space="preserve"> PAGEREF _Toc243330792 \h </w:instrText>
+          <w:instrText xml:space="preserve"> PAGEREF _Toc243332166 \h </w:instrText>
         </w:r>
         <w:r>
           <w:rPr>
@@ -499,7 +509,7 @@
             <w:noProof/>
             <w:webHidden/>
           </w:rPr>
-          <w:t>6</w:t>
+          <w:t>7</w:t>
         </w:r>
         <w:r>
           <w:rPr>
@@ -522,15 +532,17 @@
           <w:noProof/>
           <w:kern w:val="2"/>
           <w:szCs w:val="24"/>
+          <w:lang w:val="en-US"/>
           <w14:ligatures w14:val="standardContextual"/>
         </w:rPr>
       </w:pPr>
-      <w:hyperlink w:anchor="_Toc243330793" w:history="1">
+      <w:hyperlink w:anchor="_Toc243332167" w:history="1">
         <w:r>
           <w:rPr>
             <w:rStyle w:val="Hyperlink"/>
             <w:noProof/>
             <w:color w:val="000000"/>
+            <w:lang w:val="es-ES"/>
           </w:rPr>
           <w:t>3. Tema de interés de la primera práctica</w:t>
         </w:r>
@@ -553,7 +565,7 @@
             <w:noProof/>
             <w:webHidden/>
           </w:rPr>
-          <w:instrText xml:space="preserve"> PAGEREF _Toc243330793 \h </w:instrText>
+          <w:instrText xml:space="preserve"> PAGEREF _Toc243332167 \h </w:instrText>
         </w:r>
         <w:r>
           <w:rPr>
@@ -596,15 +608,17 @@
           <w:noProof/>
           <w:kern w:val="2"/>
           <w:szCs w:val="24"/>
+          <w:lang w:val="en-US"/>
           <w14:ligatures w14:val="standardContextual"/>
         </w:rPr>
       </w:pPr>
-      <w:hyperlink w:anchor="_Toc243330794" w:history="1">
+      <w:hyperlink w:anchor="_Toc243332168" w:history="1">
         <w:r>
           <w:rPr>
             <w:rStyle w:val="Hyperlink"/>
             <w:noProof/>
             <w:color w:val="000000"/>
+            <w:lang w:val="es-ES"/>
           </w:rPr>
           <w:t>4. Objetivos y especificación de la solución</w:t>
         </w:r>
@@ -627,7 +641,7 @@
             <w:noProof/>
             <w:webHidden/>
           </w:rPr>
-          <w:instrText xml:space="preserve"> PAGEREF _Toc243330794 \h </w:instrText>
+          <w:instrText xml:space="preserve"> PAGEREF _Toc243332168 \h </w:instrText>
         </w:r>
         <w:r>
           <w:rPr>
@@ -647,7 +661,7 @@
             <w:noProof/>
             <w:webHidden/>
           </w:rPr>
-          <w:t>7</w:t>
+          <w:t>8</w:t>
         </w:r>
         <w:r>
           <w:rPr>
@@ -670,15 +684,17 @@
           <w:noProof/>
           <w:kern w:val="2"/>
           <w:szCs w:val="24"/>
+          <w:lang w:val="en-US"/>
           <w14:ligatures w14:val="standardContextual"/>
         </w:rPr>
       </w:pPr>
-      <w:hyperlink w:anchor="_Toc243330795" w:history="1">
+      <w:hyperlink w:anchor="_Toc243332169" w:history="1">
         <w:r>
           <w:rPr>
             <w:rStyle w:val="Hyperlink"/>
             <w:noProof/>
             <w:color w:val="000000"/>
+            <w:lang w:val="es-ES"/>
           </w:rPr>
           <w:t>4.1 Trazabilidad entre objetivos, métodos y métricas</w:t>
         </w:r>
@@ -701,7 +717,7 @@
             <w:noProof/>
             <w:webHidden/>
           </w:rPr>
-          <w:instrText xml:space="preserve"> PAGEREF _Toc243330795 \h </w:instrText>
+          <w:instrText xml:space="preserve"> PAGEREF _Toc243332169 \h </w:instrText>
         </w:r>
         <w:r>
           <w:rPr>
@@ -744,15 +760,17 @@
           <w:noProof/>
           <w:kern w:val="2"/>
           <w:szCs w:val="24"/>
+          <w:lang w:val="en-US"/>
           <w14:ligatures w14:val="standardContextual"/>
         </w:rPr>
       </w:pPr>
-      <w:hyperlink w:anchor="_Toc243330796" w:history="1">
+      <w:hyperlink w:anchor="_Toc243332170" w:history="1">
         <w:r>
           <w:rPr>
             <w:rStyle w:val="Hyperlink"/>
             <w:noProof/>
             <w:color w:val="000000"/>
+            <w:lang w:val="es-ES"/>
           </w:rPr>
           <w:t>5. Metodología empleada de scraping</w:t>
         </w:r>
@@ -775,7 +793,7 @@
             <w:noProof/>
             <w:webHidden/>
           </w:rPr>
-          <w:instrText xml:space="preserve"> PAGEREF _Toc243330796 \h </w:instrText>
+          <w:instrText xml:space="preserve"> PAGEREF _Toc243332170 \h </w:instrText>
         </w:r>
         <w:r>
           <w:rPr>
@@ -795,7 +813,7 @@
             <w:noProof/>
             <w:webHidden/>
           </w:rPr>
-          <w:t>9</w:t>
+          <w:t>10</w:t>
         </w:r>
         <w:r>
           <w:rPr>
@@ -818,15 +836,17 @@
           <w:noProof/>
           <w:kern w:val="2"/>
           <w:szCs w:val="24"/>
+          <w:lang w:val="en-US"/>
           <w14:ligatures w14:val="standardContextual"/>
         </w:rPr>
       </w:pPr>
-      <w:hyperlink w:anchor="_Toc243330797" w:history="1">
+      <w:hyperlink w:anchor="_Toc243332171" w:history="1">
         <w:r>
           <w:rPr>
             <w:rStyle w:val="Hyperlink"/>
             <w:noProof/>
             <w:color w:val="000000"/>
+            <w:lang w:val="es-ES"/>
           </w:rPr>
           <w:t>5.1 Arquitectura de la solución</w:t>
         </w:r>
@@ -849,7 +869,7 @@
             <w:noProof/>
             <w:webHidden/>
           </w:rPr>
-          <w:instrText xml:space="preserve"> PAGEREF _Toc243330797 \h </w:instrText>
+          <w:instrText xml:space="preserve"> PAGEREF _Toc243332171 \h </w:instrText>
         </w:r>
         <w:r>
           <w:rPr>
@@ -869,7 +889,7 @@
             <w:noProof/>
             <w:webHidden/>
           </w:rPr>
-          <w:t>9</w:t>
+          <w:t>10</w:t>
         </w:r>
         <w:r>
           <w:rPr>
@@ -892,15 +912,17 @@
           <w:noProof/>
           <w:kern w:val="2"/>
           <w:szCs w:val="24"/>
+          <w:lang w:val="en-US"/>
           <w14:ligatures w14:val="standardContextual"/>
         </w:rPr>
       </w:pPr>
-      <w:hyperlink w:anchor="_Toc243330798" w:history="1">
+      <w:hyperlink w:anchor="_Toc243332172" w:history="1">
         <w:r>
           <w:rPr>
             <w:rStyle w:val="Hyperlink"/>
             <w:noProof/>
             <w:color w:val="000000"/>
+            <w:lang w:val="es-ES"/>
           </w:rPr>
           <w:t>5.2 Método 1: BeautifulSoup</w:t>
         </w:r>
@@ -923,7 +945,7 @@
             <w:noProof/>
             <w:webHidden/>
           </w:rPr>
-          <w:instrText xml:space="preserve"> PAGEREF _Toc243330798 \h </w:instrText>
+          <w:instrText xml:space="preserve"> PAGEREF _Toc243332172 \h </w:instrText>
         </w:r>
         <w:r>
           <w:rPr>
@@ -943,7 +965,7 @@
             <w:noProof/>
             <w:webHidden/>
           </w:rPr>
-          <w:t>10</w:t>
+          <w:t>11</w:t>
         </w:r>
         <w:r>
           <w:rPr>
@@ -966,15 +988,17 @@
           <w:noProof/>
           <w:kern w:val="2"/>
           <w:szCs w:val="24"/>
+          <w:lang w:val="en-US"/>
           <w14:ligatures w14:val="standardContextual"/>
         </w:rPr>
       </w:pPr>
-      <w:hyperlink w:anchor="_Toc243330799" w:history="1">
+      <w:hyperlink w:anchor="_Toc243332173" w:history="1">
         <w:r>
           <w:rPr>
             <w:rStyle w:val="Hyperlink"/>
             <w:noProof/>
             <w:color w:val="000000"/>
+            <w:lang w:val="es-ES"/>
           </w:rPr>
           <w:t>5.3 Método 2: Selenium</w:t>
         </w:r>
@@ -997,7 +1021,7 @@
             <w:noProof/>
             <w:webHidden/>
           </w:rPr>
-          <w:instrText xml:space="preserve"> PAGEREF _Toc243330799 \h </w:instrText>
+          <w:instrText xml:space="preserve"> PAGEREF _Toc243332173 \h </w:instrText>
         </w:r>
         <w:r>
           <w:rPr>
@@ -1017,7 +1041,7 @@
             <w:noProof/>
             <w:webHidden/>
           </w:rPr>
-          <w:t>11</w:t>
+          <w:t>12</w:t>
         </w:r>
         <w:r>
           <w:rPr>
@@ -1040,15 +1064,17 @@
           <w:noProof/>
           <w:kern w:val="2"/>
           <w:szCs w:val="24"/>
+          <w:lang w:val="en-US"/>
           <w14:ligatures w14:val="standardContextual"/>
         </w:rPr>
       </w:pPr>
-      <w:hyperlink w:anchor="_Toc243330800" w:history="1">
+      <w:hyperlink w:anchor="_Toc243332174" w:history="1">
         <w:r>
           <w:rPr>
             <w:rStyle w:val="Hyperlink"/>
             <w:noProof/>
             <w:color w:val="000000"/>
+            <w:lang w:val="es-ES"/>
           </w:rPr>
           <w:t>5.4 Método 3: Scrapy</w:t>
         </w:r>
@@ -1071,7 +1097,7 @@
             <w:noProof/>
             <w:webHidden/>
           </w:rPr>
-          <w:instrText xml:space="preserve"> PAGEREF _Toc243330800 \h </w:instrText>
+          <w:instrText xml:space="preserve"> PAGEREF _Toc243332174 \h </w:instrText>
         </w:r>
         <w:r>
           <w:rPr>
@@ -1114,15 +1140,17 @@
           <w:noProof/>
           <w:kern w:val="2"/>
           <w:szCs w:val="24"/>
+          <w:lang w:val="en-US"/>
           <w14:ligatures w14:val="standardContextual"/>
         </w:rPr>
       </w:pPr>
-      <w:hyperlink w:anchor="_Toc243330801" w:history="1">
+      <w:hyperlink w:anchor="_Toc243332175" w:history="1">
         <w:r>
           <w:rPr>
             <w:rStyle w:val="Hyperlink"/>
             <w:noProof/>
             <w:color w:val="000000"/>
+            <w:lang w:val="es-ES"/>
           </w:rPr>
           <w:t>5.5 Consideraciones éticas y legales</w:t>
         </w:r>
@@ -1145,7 +1173,7 @@
             <w:noProof/>
             <w:webHidden/>
           </w:rPr>
-          <w:instrText xml:space="preserve"> PAGEREF _Toc243330801 \h </w:instrText>
+          <w:instrText xml:space="preserve"> PAGEREF _Toc243332175 \h </w:instrText>
         </w:r>
         <w:r>
           <w:rPr>
@@ -1165,7 +1193,7 @@
             <w:noProof/>
             <w:webHidden/>
           </w:rPr>
-          <w:t>12</w:t>
+          <w:t>13</w:t>
         </w:r>
         <w:r>
           <w:rPr>
@@ -1188,15 +1216,17 @@
           <w:noProof/>
           <w:kern w:val="2"/>
           <w:szCs w:val="24"/>
+          <w:lang w:val="en-US"/>
           <w14:ligatures w14:val="standardContextual"/>
         </w:rPr>
       </w:pPr>
-      <w:hyperlink w:anchor="_Toc243330802" w:history="1">
+      <w:hyperlink w:anchor="_Toc243332176" w:history="1">
         <w:r>
           <w:rPr>
             <w:rStyle w:val="Hyperlink"/>
             <w:noProof/>
             <w:color w:val="000000"/>
+            <w:lang w:val="es-ES"/>
           </w:rPr>
           <w:t>5.6 Métricas de éxito</w:t>
         </w:r>
@@ -1219,7 +1249,7 @@
             <w:noProof/>
             <w:webHidden/>
           </w:rPr>
-          <w:instrText xml:space="preserve"> PAGEREF _Toc243330802 \h </w:instrText>
+          <w:instrText xml:space="preserve"> PAGEREF _Toc243332176 \h </w:instrText>
         </w:r>
         <w:r>
           <w:rPr>
@@ -1262,15 +1292,17 @@
           <w:noProof/>
           <w:kern w:val="2"/>
           <w:szCs w:val="24"/>
+          <w:lang w:val="en-US"/>
           <w14:ligatures w14:val="standardContextual"/>
         </w:rPr>
       </w:pPr>
-      <w:hyperlink w:anchor="_Toc243330803" w:history="1">
+      <w:hyperlink w:anchor="_Toc243332177" w:history="1">
         <w:r>
           <w:rPr>
             <w:rStyle w:val="Hyperlink"/>
             <w:noProof/>
             <w:color w:val="000000"/>
+            <w:lang w:val="es-ES"/>
           </w:rPr>
           <w:t>6. Resultados</w:t>
         </w:r>
@@ -1293,7 +1325,7 @@
             <w:noProof/>
             <w:webHidden/>
           </w:rPr>
-          <w:instrText xml:space="preserve"> PAGEREF _Toc243330803 \h </w:instrText>
+          <w:instrText xml:space="preserve"> PAGEREF _Toc243332177 \h </w:instrText>
         </w:r>
         <w:r>
           <w:rPr>
@@ -1313,7 +1345,7 @@
             <w:noProof/>
             <w:webHidden/>
           </w:rPr>
-          <w:t>13</w:t>
+          <w:t>14</w:t>
         </w:r>
         <w:r>
           <w:rPr>
@@ -1336,15 +1368,17 @@
           <w:noProof/>
           <w:kern w:val="2"/>
           <w:szCs w:val="24"/>
+          <w:lang w:val="en-US"/>
           <w14:ligatures w14:val="standardContextual"/>
         </w:rPr>
       </w:pPr>
-      <w:hyperlink w:anchor="_Toc243330804" w:history="1">
+      <w:hyperlink w:anchor="_Toc243332178" w:history="1">
         <w:r>
           <w:rPr>
             <w:rStyle w:val="Hyperlink"/>
             <w:noProof/>
             <w:color w:val="000000"/>
+            <w:lang w:val="es-ES"/>
           </w:rPr>
           <w:t>6.1 Ejecución del pipeline</w:t>
         </w:r>
@@ -1367,7 +1401,7 @@
             <w:noProof/>
             <w:webHidden/>
           </w:rPr>
-          <w:instrText xml:space="preserve"> PAGEREF _Toc243330804 \h </w:instrText>
+          <w:instrText xml:space="preserve"> PAGEREF _Toc243332178 \h </w:instrText>
         </w:r>
         <w:r>
           <w:rPr>
@@ -1387,7 +1421,7 @@
             <w:noProof/>
             <w:webHidden/>
           </w:rPr>
-          <w:t>13</w:t>
+          <w:t>14</w:t>
         </w:r>
         <w:r>
           <w:rPr>
@@ -1410,15 +1444,17 @@
           <w:noProof/>
           <w:kern w:val="2"/>
           <w:szCs w:val="24"/>
+          <w:lang w:val="en-US"/>
           <w14:ligatures w14:val="standardContextual"/>
         </w:rPr>
       </w:pPr>
-      <w:hyperlink w:anchor="_Toc243330805" w:history="1">
+      <w:hyperlink w:anchor="_Toc243332179" w:history="1">
         <w:r>
           <w:rPr>
             <w:rStyle w:val="Hyperlink"/>
             <w:noProof/>
             <w:color w:val="000000"/>
+            <w:lang w:val="es-ES"/>
           </w:rPr>
           <w:t>6.2 El catálogo extraído</w:t>
         </w:r>
@@ -1441,7 +1477,7 @@
             <w:noProof/>
             <w:webHidden/>
           </w:rPr>
-          <w:instrText xml:space="preserve"> PAGEREF _Toc243330805 \h </w:instrText>
+          <w:instrText xml:space="preserve"> PAGEREF _Toc243332179 \h </w:instrText>
         </w:r>
         <w:r>
           <w:rPr>
@@ -1484,15 +1520,17 @@
           <w:noProof/>
           <w:kern w:val="2"/>
           <w:szCs w:val="24"/>
+          <w:lang w:val="en-US"/>
           <w14:ligatures w14:val="standardContextual"/>
         </w:rPr>
       </w:pPr>
-      <w:hyperlink w:anchor="_Toc243330806" w:history="1">
+      <w:hyperlink w:anchor="_Toc243332180" w:history="1">
         <w:r>
           <w:rPr>
             <w:rStyle w:val="Hyperlink"/>
             <w:noProof/>
             <w:color w:val="000000"/>
+            <w:lang w:val="es-ES"/>
           </w:rPr>
           <w:t>6.3 El artículo analizado</w:t>
         </w:r>
@@ -1515,7 +1553,7 @@
             <w:noProof/>
             <w:webHidden/>
           </w:rPr>
-          <w:instrText xml:space="preserve"> PAGEREF _Toc243330806 \h </w:instrText>
+          <w:instrText xml:space="preserve"> PAGEREF _Toc243332180 \h </w:instrText>
         </w:r>
         <w:r>
           <w:rPr>
@@ -1558,15 +1596,17 @@
           <w:noProof/>
           <w:kern w:val="2"/>
           <w:szCs w:val="24"/>
+          <w:lang w:val="en-US"/>
           <w14:ligatures w14:val="standardContextual"/>
         </w:rPr>
       </w:pPr>
-      <w:hyperlink w:anchor="_Toc243330807" w:history="1">
+      <w:hyperlink w:anchor="_Toc243332181" w:history="1">
         <w:r>
           <w:rPr>
             <w:rStyle w:val="Hyperlink"/>
             <w:noProof/>
             <w:color w:val="000000"/>
+            <w:lang w:val="es-ES"/>
           </w:rPr>
           <w:t>6.4 Precio frente a reputación</w:t>
         </w:r>
@@ -1589,7 +1629,7 @@
             <w:noProof/>
             <w:webHidden/>
           </w:rPr>
-          <w:instrText xml:space="preserve"> PAGEREF _Toc243330807 \h </w:instrText>
+          <w:instrText xml:space="preserve"> PAGEREF _Toc243332181 \h </w:instrText>
         </w:r>
         <w:r>
           <w:rPr>
@@ -1632,15 +1672,17 @@
           <w:noProof/>
           <w:kern w:val="2"/>
           <w:szCs w:val="24"/>
+          <w:lang w:val="en-US"/>
           <w14:ligatures w14:val="standardContextual"/>
         </w:rPr>
       </w:pPr>
-      <w:hyperlink w:anchor="_Toc243330808" w:history="1">
+      <w:hyperlink w:anchor="_Toc243332182" w:history="1">
         <w:r>
           <w:rPr>
             <w:rStyle w:val="Hyperlink"/>
             <w:noProof/>
             <w:color w:val="000000"/>
+            <w:lang w:val="es-ES"/>
           </w:rPr>
           <w:t>6.5 Comparación de métodos y concordancia</w:t>
         </w:r>
@@ -1663,7 +1705,7 @@
             <w:noProof/>
             <w:webHidden/>
           </w:rPr>
-          <w:instrText xml:space="preserve"> PAGEREF _Toc243330808 \h </w:instrText>
+          <w:instrText xml:space="preserve"> PAGEREF _Toc243332182 \h </w:instrText>
         </w:r>
         <w:r>
           <w:rPr>
@@ -1706,15 +1748,17 @@
           <w:noProof/>
           <w:kern w:val="2"/>
           <w:szCs w:val="24"/>
+          <w:lang w:val="en-US"/>
           <w14:ligatures w14:val="standardContextual"/>
         </w:rPr>
       </w:pPr>
-      <w:hyperlink w:anchor="_Toc243330809" w:history="1">
+      <w:hyperlink w:anchor="_Toc243332183" w:history="1">
         <w:r>
           <w:rPr>
             <w:rStyle w:val="Hyperlink"/>
             <w:noProof/>
             <w:color w:val="000000"/>
+            <w:lang w:val="es-ES"/>
           </w:rPr>
           <w:t>6.6 Validación contra las métricas de éxito</w:t>
         </w:r>
@@ -1737,7 +1781,7 @@
             <w:noProof/>
             <w:webHidden/>
           </w:rPr>
-          <w:instrText xml:space="preserve"> PAGEREF _Toc243330809 \h </w:instrText>
+          <w:instrText xml:space="preserve"> PAGEREF _Toc243332183 \h </w:instrText>
         </w:r>
         <w:r>
           <w:rPr>
@@ -1780,15 +1824,17 @@
           <w:noProof/>
           <w:kern w:val="2"/>
           <w:szCs w:val="24"/>
+          <w:lang w:val="en-US"/>
           <w14:ligatures w14:val="standardContextual"/>
         </w:rPr>
       </w:pPr>
-      <w:hyperlink w:anchor="_Toc243330810" w:history="1">
+      <w:hyperlink w:anchor="_Toc243332184" w:history="1">
         <w:r>
           <w:rPr>
             <w:rStyle w:val="Hyperlink"/>
             <w:noProof/>
             <w:color w:val="000000"/>
+            <w:lang w:val="es-ES"/>
           </w:rPr>
           <w:t>7. Conclusiones</w:t>
         </w:r>
@@ -1811,7 +1857,7 @@
             <w:noProof/>
             <w:webHidden/>
           </w:rPr>
-          <w:instrText xml:space="preserve"> PAGEREF _Toc243330810 \h </w:instrText>
+          <w:instrText xml:space="preserve"> PAGEREF _Toc243332184 \h </w:instrText>
         </w:r>
         <w:r>
           <w:rPr>
@@ -1831,7 +1877,7 @@
             <w:noProof/>
             <w:webHidden/>
           </w:rPr>
-          <w:t>19</w:t>
+          <w:t>20</w:t>
         </w:r>
         <w:r>
           <w:rPr>
@@ -1854,10 +1900,11 @@
           <w:noProof/>
           <w:kern w:val="2"/>
           <w:szCs w:val="24"/>
+          <w:lang w:val="en-US"/>
           <w14:ligatures w14:val="standardContextual"/>
         </w:rPr>
       </w:pPr>
-      <w:hyperlink w:anchor="_Toc243330811" w:history="1">
+      <w:hyperlink w:anchor="_Toc243332185" w:history="1">
         <w:r>
           <w:rPr>
             <w:rStyle w:val="Hyperlink"/>
@@ -1885,7 +1932,7 @@
             <w:noProof/>
             <w:webHidden/>
           </w:rPr>
-          <w:instrText xml:space="preserve"> PAGEREF _Toc243330811 \h </w:instrText>
+          <w:instrText xml:space="preserve"> PAGEREF _Toc243332185 \h </w:instrText>
         </w:r>
         <w:r>
           <w:rPr>
@@ -1905,7 +1952,7 @@
             <w:noProof/>
             <w:webHidden/>
           </w:rPr>
-          <w:t>21</w:t>
+          <w:t>22</w:t>
         </w:r>
         <w:r>
           <w:rPr>
@@ -1928,15 +1975,17 @@
           <w:noProof/>
           <w:kern w:val="2"/>
           <w:szCs w:val="24"/>
+          <w:lang w:val="en-US"/>
           <w14:ligatures w14:val="standardContextual"/>
         </w:rPr>
       </w:pPr>
-      <w:hyperlink w:anchor="_Toc243330812" w:history="1">
+      <w:hyperlink w:anchor="_Toc243332186" w:history="1">
         <w:r>
           <w:rPr>
             <w:rStyle w:val="Hyperlink"/>
             <w:noProof/>
             <w:color w:val="000000"/>
+            <w:lang w:val="es-ES"/>
           </w:rPr>
           <w:t>Apéndice A. Código fuente</w:t>
         </w:r>
@@ -1959,7 +2008,7 @@
             <w:noProof/>
             <w:webHidden/>
           </w:rPr>
-          <w:instrText xml:space="preserve"> PAGEREF _Toc243330812 \h </w:instrText>
+          <w:instrText xml:space="preserve"> PAGEREF _Toc243332186 \h </w:instrText>
         </w:r>
         <w:r>
           <w:rPr>
@@ -1979,7 +2028,7 @@
             <w:noProof/>
             <w:webHidden/>
           </w:rPr>
-          <w:t>22</w:t>
+          <w:t>23</w:t>
         </w:r>
         <w:r>
           <w:rPr>
@@ -2002,15 +2051,17 @@
           <w:noProof/>
           <w:kern w:val="2"/>
           <w:szCs w:val="24"/>
+          <w:lang w:val="en-US"/>
           <w14:ligatures w14:val="standardContextual"/>
         </w:rPr>
       </w:pPr>
-      <w:hyperlink w:anchor="_Toc243330813" w:history="1">
+      <w:hyperlink w:anchor="_Toc243332187" w:history="1">
         <w:r>
           <w:rPr>
             <w:rStyle w:val="Hyperlink"/>
             <w:noProof/>
             <w:color w:val="000000"/>
+            <w:lang w:val="es-ES"/>
           </w:rPr>
           <w:t>A.1 Normalización compartida (fragmento de src/normalizers.py)</w:t>
         </w:r>
@@ -2033,7 +2084,7 @@
             <w:noProof/>
             <w:webHidden/>
           </w:rPr>
-          <w:instrText xml:space="preserve"> PAGEREF _Toc243330813 \h </w:instrText>
+          <w:instrText xml:space="preserve"> PAGEREF _Toc243332187 \h </w:instrText>
         </w:r>
         <w:r>
           <w:rPr>
@@ -2053,7 +2104,7 @@
             <w:noProof/>
             <w:webHidden/>
           </w:rPr>
-          <w:t>22</w:t>
+          <w:t>23</w:t>
         </w:r>
         <w:r>
           <w:rPr>
@@ -2076,15 +2127,17 @@
           <w:noProof/>
           <w:kern w:val="2"/>
           <w:szCs w:val="24"/>
+          <w:lang w:val="en-US"/>
           <w14:ligatures w14:val="standardContextual"/>
         </w:rPr>
       </w:pPr>
-      <w:hyperlink w:anchor="_Toc243330814" w:history="1">
+      <w:hyperlink w:anchor="_Toc243332188" w:history="1">
         <w:r>
           <w:rPr>
             <w:rStyle w:val="Hyperlink"/>
             <w:noProof/>
             <w:color w:val="000000"/>
+            <w:lang w:val="es-ES"/>
           </w:rPr>
           <w:t>A.2 Extracción estática con BeautifulSoup (fragmento de src/scrapers/bs4_scraper.py)</w:t>
         </w:r>
@@ -2107,7 +2160,7 @@
             <w:noProof/>
             <w:webHidden/>
           </w:rPr>
-          <w:instrText xml:space="preserve"> PAGEREF _Toc243330814 \h </w:instrText>
+          <w:instrText xml:space="preserve"> PAGEREF _Toc243332188 \h </w:instrText>
         </w:r>
         <w:r>
           <w:rPr>
@@ -2127,7 +2180,7 @@
             <w:noProof/>
             <w:webHidden/>
           </w:rPr>
-          <w:t>22</w:t>
+          <w:t>23</w:t>
         </w:r>
         <w:r>
           <w:rPr>
@@ -2150,15 +2203,17 @@
           <w:noProof/>
           <w:kern w:val="2"/>
           <w:szCs w:val="24"/>
+          <w:lang w:val="en-US"/>
           <w14:ligatures w14:val="standardContextual"/>
         </w:rPr>
       </w:pPr>
-      <w:hyperlink w:anchor="_Toc243330815" w:history="1">
+      <w:hyperlink w:anchor="_Toc243332189" w:history="1">
         <w:r>
           <w:rPr>
             <w:rStyle w:val="Hyperlink"/>
             <w:noProof/>
             <w:color w:val="000000"/>
+            <w:lang w:val="es-ES"/>
           </w:rPr>
           <w:t>A.3 Fijación del contexto de entrega con Selenium (fragmento de src/session_bootstrap.py)</w:t>
         </w:r>
@@ -2181,7 +2236,7 @@
             <w:noProof/>
             <w:webHidden/>
           </w:rPr>
-          <w:instrText xml:space="preserve"> PAGEREF _Toc243330815 \h </w:instrText>
+          <w:instrText xml:space="preserve"> PAGEREF _Toc243332189 \h </w:instrText>
         </w:r>
         <w:r>
           <w:rPr>
@@ -2201,7 +2256,7 @@
             <w:noProof/>
             <w:webHidden/>
           </w:rPr>
-          <w:t>23</w:t>
+          <w:t>24</w:t>
         </w:r>
         <w:r>
           <w:rPr>
@@ -2224,15 +2279,17 @@
           <w:noProof/>
           <w:kern w:val="2"/>
           <w:szCs w:val="24"/>
+          <w:lang w:val="en-US"/>
           <w14:ligatures w14:val="standardContextual"/>
         </w:rPr>
       </w:pPr>
-      <w:hyperlink w:anchor="_Toc243330816" w:history="1">
+      <w:hyperlink w:anchor="_Toc243332190" w:history="1">
         <w:r>
           <w:rPr>
             <w:rStyle w:val="Hyperlink"/>
             <w:noProof/>
             <w:color w:val="000000"/>
+            <w:lang w:val="es-ES"/>
           </w:rPr>
           <w:t>A.4 Crawler asíncrono con Scrapy (fragmento de spiders/productos.py)</w:t>
         </w:r>
@@ -2255,7 +2312,7 @@
             <w:noProof/>
             <w:webHidden/>
           </w:rPr>
-          <w:instrText xml:space="preserve"> PAGEREF _Toc243330816 \h </w:instrText>
+          <w:instrText xml:space="preserve"> PAGEREF _Toc243332190 \h </w:instrText>
         </w:r>
         <w:r>
           <w:rPr>
@@ -2275,7 +2332,7 @@
             <w:noProof/>
             <w:webHidden/>
           </w:rPr>
-          <w:t>23</w:t>
+          <w:t>24</w:t>
         </w:r>
         <w:r>
           <w:rPr>
@@ -2298,15 +2355,17 @@
           <w:noProof/>
           <w:kern w:val="2"/>
           <w:szCs w:val="24"/>
+          <w:lang w:val="en-US"/>
           <w14:ligatures w14:val="standardContextual"/>
         </w:rPr>
       </w:pPr>
-      <w:hyperlink w:anchor="_Toc243330817" w:history="1">
+      <w:hyperlink w:anchor="_Toc243332191" w:history="1">
         <w:r>
           <w:rPr>
             <w:rStyle w:val="Hyperlink"/>
             <w:noProof/>
             <w:color w:val="000000"/>
+            <w:lang w:val="es-ES"/>
           </w:rPr>
           <w:t>A.5 Ejecución</w:t>
         </w:r>
@@ -2329,7 +2388,7 @@
             <w:noProof/>
             <w:webHidden/>
           </w:rPr>
-          <w:instrText xml:space="preserve"> PAGEREF _Toc243330817 \h </w:instrText>
+          <w:instrText xml:space="preserve"> PAGEREF _Toc243332191 \h </w:instrText>
         </w:r>
         <w:r>
           <w:rPr>
@@ -2349,7 +2408,7 @@
             <w:noProof/>
             <w:webHidden/>
           </w:rPr>
-          <w:t>23</w:t>
+          <w:t>24</w:t>
         </w:r>
         <w:r>
           <w:rPr>
@@ -2392,7 +2451,7 @@
           <w:lang w:val="es-ES"/>
         </w:rPr>
       </w:pPr>
-      <w:bookmarkStart w:id="0" w:name="_Toc243330788"/>
+      <w:bookmarkStart w:id="0" w:name="_Toc243332162"/>
       <w:r>
         <w:rPr>
           <w:rFonts w:ascii="Times New Roman" w:eastAsia="Times New Roman" w:hAnsi="Times New Roman" w:cs="Times New Roman"/>
@@ -2467,7 +2526,6 @@
           <w:lang w:val="es-ES"/>
         </w:rPr>
       </w:pPr>
-      <w:bookmarkStart w:id="1" w:name="_Toc243330789"/>
       <w:r>
         <w:rPr>
           <w:lang w:val="es-ES"/>
@@ -2482,6 +2540,7 @@
           <w:lang w:val="es-ES"/>
         </w:rPr>
       </w:pPr>
+      <w:bookmarkStart w:id="1" w:name="_Toc243332163"/>
       <w:r>
         <w:rPr>
           <w:rFonts w:ascii="Times New Roman" w:eastAsia="Times New Roman" w:hAnsi="Times New Roman" w:cs="Times New Roman"/>
@@ -2641,7 +2700,7 @@
           <w:lang w:val="es-ES"/>
         </w:rPr>
       </w:pPr>
-      <w:bookmarkStart w:id="2" w:name="_Toc243330790"/>
+      <w:bookmarkStart w:id="2" w:name="_Toc243332164"/>
       <w:r>
         <w:rPr>
           <w:rFonts w:ascii="Times New Roman" w:eastAsia="Times New Roman" w:hAnsi="Times New Roman" w:cs="Times New Roman"/>
@@ -2659,7 +2718,7 @@
           <w:lang w:val="es-ES"/>
         </w:rPr>
       </w:pPr>
-      <w:bookmarkStart w:id="3" w:name="_Toc243330791"/>
+      <w:bookmarkStart w:id="3" w:name="_Toc243332165"/>
       <w:r>
         <w:rPr>
           <w:rFonts w:ascii="Times New Roman" w:eastAsia="Times New Roman" w:hAnsi="Times New Roman" w:cs="Times New Roman"/>
@@ -2888,7 +2947,7 @@
           <w:lang w:val="es-ES"/>
         </w:rPr>
       </w:pPr>
-      <w:bookmarkStart w:id="4" w:name="_Toc243330792"/>
+      <w:bookmarkStart w:id="4" w:name="_Toc243332166"/>
       <w:r>
         <w:rPr>
           <w:rFonts w:ascii="Times New Roman" w:eastAsia="Times New Roman" w:hAnsi="Times New Roman" w:cs="Times New Roman"/>
@@ -2961,7 +3020,7 @@
           <w:lang w:val="es-ES"/>
         </w:rPr>
       </w:pPr>
-      <w:bookmarkStart w:id="5" w:name="_Toc243330793"/>
+      <w:bookmarkStart w:id="5" w:name="_Toc243332167"/>
       <w:r>
         <w:rPr>
           <w:rFonts w:ascii="Times New Roman" w:eastAsia="Times New Roman" w:hAnsi="Times New Roman" w:cs="Times New Roman"/>
@@ -3103,7 +3162,7 @@
           <w:lang w:val="es-ES"/>
         </w:rPr>
       </w:pPr>
-      <w:bookmarkStart w:id="6" w:name="_Toc243330794"/>
+      <w:bookmarkStart w:id="6" w:name="_Toc243332168"/>
       <w:r>
         <w:rPr>
           <w:rFonts w:ascii="Times New Roman" w:eastAsia="Times New Roman" w:hAnsi="Times New Roman" w:cs="Times New Roman"/>
@@ -3296,7 +3355,7 @@
           <w:lang w:val="es-ES"/>
         </w:rPr>
       </w:pPr>
-      <w:bookmarkStart w:id="7" w:name="_Toc243330795"/>
+      <w:bookmarkStart w:id="7" w:name="_Toc243332169"/>
       <w:r>
         <w:rPr>
           <w:rFonts w:ascii="Times New Roman" w:eastAsia="Times New Roman" w:hAnsi="Times New Roman" w:cs="Times New Roman"/>
@@ -3820,7 +3879,6 @@
           <w:lang w:val="es-ES"/>
         </w:rPr>
       </w:pPr>
-      <w:bookmarkStart w:id="8" w:name="_Toc243330796"/>
       <w:r>
         <w:rPr>
           <w:lang w:val="es-ES"/>
@@ -3835,6 +3893,7 @@
           <w:lang w:val="es-ES"/>
         </w:rPr>
       </w:pPr>
+      <w:bookmarkStart w:id="8" w:name="_Toc243332170"/>
       <w:r>
         <w:rPr>
           <w:rFonts w:ascii="Times New Roman" w:eastAsia="Times New Roman" w:hAnsi="Times New Roman" w:cs="Times New Roman"/>
@@ -3866,7 +3925,7 @@
           <w:lang w:val="es-ES"/>
         </w:rPr>
       </w:pPr>
-      <w:bookmarkStart w:id="9" w:name="_Toc243330797"/>
+      <w:bookmarkStart w:id="9" w:name="_Toc243332171"/>
       <w:r>
         <w:rPr>
           <w:rFonts w:ascii="Times New Roman" w:eastAsia="Times New Roman" w:hAnsi="Times New Roman" w:cs="Times New Roman"/>
@@ -4124,7 +4183,7 @@
           <w:lang w:val="es-ES"/>
         </w:rPr>
       </w:pPr>
-      <w:bookmarkStart w:id="10" w:name="_Toc243330798"/>
+      <w:bookmarkStart w:id="10" w:name="_Toc243332172"/>
       <w:r>
         <w:rPr>
           <w:rFonts w:ascii="Times New Roman" w:eastAsia="Times New Roman" w:hAnsi="Times New Roman" w:cs="Times New Roman"/>
@@ -4678,7 +4737,6 @@
           <w:lang w:val="es-ES"/>
         </w:rPr>
       </w:pPr>
-      <w:bookmarkStart w:id="11" w:name="_Toc243330799"/>
       <w:r>
         <w:rPr>
           <w:lang w:val="es-ES"/>
@@ -4693,6 +4751,7 @@
           <w:lang w:val="es-ES"/>
         </w:rPr>
       </w:pPr>
+      <w:bookmarkStart w:id="11" w:name="_Toc243332173"/>
       <w:r>
         <w:rPr>
           <w:rFonts w:ascii="Times New Roman" w:eastAsia="Times New Roman" w:hAnsi="Times New Roman" w:cs="Times New Roman"/>
@@ -4962,7 +5021,7 @@
           <w:lang w:val="es-ES"/>
         </w:rPr>
       </w:pPr>
-      <w:bookmarkStart w:id="12" w:name="_Toc243330800"/>
+      <w:bookmarkStart w:id="12" w:name="_Toc243332174"/>
       <w:r>
         <w:rPr>
           <w:rFonts w:ascii="Times New Roman" w:eastAsia="Times New Roman" w:hAnsi="Times New Roman" w:cs="Times New Roman"/>
@@ -5123,7 +5182,7 @@
           <w:lang w:val="es-ES"/>
         </w:rPr>
       </w:pPr>
-      <w:bookmarkStart w:id="13" w:name="_Toc243330801"/>
+      <w:bookmarkStart w:id="13" w:name="_Toc243332175"/>
       <w:r>
         <w:rPr>
           <w:rFonts w:ascii="Times New Roman" w:eastAsia="Times New Roman" w:hAnsi="Times New Roman" w:cs="Times New Roman"/>
@@ -5168,7 +5227,7 @@
           <w:lang w:val="es-ES"/>
         </w:rPr>
       </w:pPr>
-      <w:bookmarkStart w:id="14" w:name="_Toc243330802"/>
+      <w:bookmarkStart w:id="14" w:name="_Toc243332176"/>
       <w:r>
         <w:rPr>
           <w:rFonts w:ascii="Times New Roman" w:eastAsia="Times New Roman" w:hAnsi="Times New Roman" w:cs="Times New Roman"/>
@@ -5648,7 +5707,7 @@
           <w:lang w:val="es-ES"/>
         </w:rPr>
       </w:pPr>
-      <w:bookmarkStart w:id="15" w:name="_Toc243330803"/>
+      <w:bookmarkStart w:id="15" w:name="_Toc243332177"/>
       <w:r>
         <w:rPr>
           <w:rFonts w:ascii="Times New Roman" w:eastAsia="Times New Roman" w:hAnsi="Times New Roman" w:cs="Times New Roman"/>
@@ -5666,7 +5725,7 @@
           <w:lang w:val="es-ES"/>
         </w:rPr>
       </w:pPr>
-      <w:bookmarkStart w:id="16" w:name="_Toc243330804"/>
+      <w:bookmarkStart w:id="16" w:name="_Toc243332178"/>
       <w:r>
         <w:rPr>
           <w:rFonts w:ascii="Times New Roman" w:eastAsia="Times New Roman" w:hAnsi="Times New Roman" w:cs="Times New Roman"/>
@@ -6166,7 +6225,7 @@
           <w:lang w:val="es-ES"/>
         </w:rPr>
       </w:pPr>
-      <w:bookmarkStart w:id="17" w:name="_Toc243330805"/>
+      <w:bookmarkStart w:id="17" w:name="_Toc243332179"/>
       <w:r>
         <w:rPr>
           <w:rFonts w:ascii="Times New Roman" w:eastAsia="Times New Roman" w:hAnsi="Times New Roman" w:cs="Times New Roman"/>
@@ -6339,7 +6398,7 @@
           <w:lang w:val="es-ES"/>
         </w:rPr>
       </w:pPr>
-      <w:bookmarkStart w:id="18" w:name="_Toc243330806"/>
+      <w:bookmarkStart w:id="18" w:name="_Toc243332180"/>
       <w:r>
         <w:rPr>
           <w:rFonts w:ascii="Times New Roman" w:eastAsia="Times New Roman" w:hAnsi="Times New Roman" w:cs="Times New Roman"/>
@@ -7012,7 +7071,7 @@
           <w:lang w:val="es-ES"/>
         </w:rPr>
       </w:pPr>
-      <w:bookmarkStart w:id="19" w:name="_Toc243330807"/>
+      <w:bookmarkStart w:id="19" w:name="_Toc243332181"/>
       <w:r>
         <w:rPr>
           <w:rFonts w:ascii="Times New Roman" w:eastAsia="Times New Roman" w:hAnsi="Times New Roman" w:cs="Times New Roman"/>
@@ -7274,7 +7333,7 @@
           <w:lang w:val="es-ES"/>
         </w:rPr>
       </w:pPr>
-      <w:bookmarkStart w:id="20" w:name="_Toc243330808"/>
+      <w:bookmarkStart w:id="20" w:name="_Toc243332182"/>
       <w:r>
         <w:rPr>
           <w:rFonts w:ascii="Times New Roman" w:eastAsia="Times New Roman" w:hAnsi="Times New Roman" w:cs="Times New Roman"/>
@@ -7434,7 +7493,7 @@
           <w:lang w:val="es-ES"/>
         </w:rPr>
       </w:pPr>
-      <w:bookmarkStart w:id="21" w:name="_Toc243330809"/>
+      <w:bookmarkStart w:id="21" w:name="_Toc243332183"/>
       <w:r>
         <w:rPr>
           <w:rFonts w:ascii="Times New Roman" w:eastAsia="Times New Roman" w:hAnsi="Times New Roman" w:cs="Times New Roman"/>
@@ -8018,7 +8077,6 @@
           <w:lang w:val="es-ES"/>
         </w:rPr>
       </w:pPr>
-      <w:bookmarkStart w:id="22" w:name="_Toc243330810"/>
       <w:r>
         <w:rPr>
           <w:lang w:val="es-ES"/>
@@ -8033,6 +8091,7 @@
           <w:lang w:val="es-ES"/>
         </w:rPr>
       </w:pPr>
+      <w:bookmarkStart w:id="22" w:name="_Toc243332184"/>
       <w:r>
         <w:rPr>
           <w:rFonts w:ascii="Times New Roman" w:eastAsia="Times New Roman" w:hAnsi="Times New Roman" w:cs="Times New Roman"/>
@@ -8291,7 +8350,7 @@
         <w:pStyle w:val="Heading1"/>
         <w:pageBreakBefore/>
       </w:pPr>
-      <w:bookmarkStart w:id="23" w:name="_Toc243330811"/>
+      <w:bookmarkStart w:id="23" w:name="_Toc243332185"/>
       <w:r>
         <w:rPr>
           <w:rFonts w:ascii="Times New Roman" w:eastAsia="Times New Roman" w:hAnsi="Times New Roman" w:cs="Times New Roman"/>
@@ -8408,19 +8467,7 @@
           <w:rPr>
             <w:u w:val="single"/>
           </w:rPr>
-          <w:t>https://www.crummy.com/software/BeautifulSoup/bs</w:t>
-        </w:r>
-        <w:r>
-          <w:rPr>
-            <w:u w:val="single"/>
-          </w:rPr>
-          <w:t>4</w:t>
-        </w:r>
-        <w:r>
-          <w:rPr>
-            <w:u w:val="single"/>
-          </w:rPr>
-          <w:t>/doc/</w:t>
+          <w:t>https://www.crummy.com/software/BeautifulSoup/bs4/doc/</w:t>
         </w:r>
       </w:hyperlink>
     </w:p>
@@ -8483,7 +8530,7 @@
           <w:lang w:val="es-ES"/>
         </w:rPr>
       </w:pPr>
-      <w:bookmarkStart w:id="24" w:name="_Toc243330812"/>
+      <w:bookmarkStart w:id="24" w:name="_Toc243332186"/>
       <w:r>
         <w:rPr>
           <w:rFonts w:ascii="Times New Roman" w:eastAsia="Times New Roman" w:hAnsi="Times New Roman" w:cs="Times New Roman"/>
@@ -8505,7 +8552,21 @@
         <w:rPr>
           <w:lang w:val="es-ES"/>
         </w:rPr>
-        <w:t xml:space="preserve">El código completo se entrega en el repositorio del proyecto y en el cuaderno </w:t>
+        <w:t xml:space="preserve">El código completo se entrega en el repositorio </w:t>
+      </w:r>
+      <w:hyperlink r:id="rId15">
+        <w:r>
+          <w:rPr>
+            <w:u w:val="single"/>
+          </w:rPr>
+          <w:t>https://github.com/jesusjoelgonca/ea1-web-scraping-amazon</w:t>
+        </w:r>
+      </w:hyperlink>
+      <w:r>
+        <w:rPr>
+          <w:lang w:val="es-ES"/>
+        </w:rPr>
+        <w:t xml:space="preserve"> y en el cuaderno </w:t>
       </w:r>
       <w:r>
         <w:rPr>
@@ -8529,7 +8590,7 @@
           <w:lang w:val="es-ES"/>
         </w:rPr>
       </w:pPr>
-      <w:bookmarkStart w:id="25" w:name="_Toc243330813"/>
+      <w:bookmarkStart w:id="25" w:name="_Toc243332187"/>
       <w:r>
         <w:rPr>
           <w:rFonts w:ascii="Times New Roman" w:eastAsia="Times New Roman" w:hAnsi="Times New Roman" w:cs="Times New Roman"/>
@@ -8752,7 +8813,7 @@
           <w:lang w:val="es-ES"/>
         </w:rPr>
       </w:pPr>
-      <w:bookmarkStart w:id="26" w:name="_Toc243330814"/>
+      <w:bookmarkStart w:id="26" w:name="_Toc243332188"/>
       <w:r>
         <w:rPr>
           <w:rFonts w:ascii="Times New Roman" w:eastAsia="Times New Roman" w:hAnsi="Times New Roman" w:cs="Times New Roman"/>
@@ -8993,7 +9054,7 @@
           <w:lang w:val="es-ES"/>
         </w:rPr>
       </w:pPr>
-      <w:bookmarkStart w:id="27" w:name="_Toc243330815"/>
+      <w:bookmarkStart w:id="27" w:name="_Toc243332189"/>
       <w:r>
         <w:rPr>
           <w:rFonts w:ascii="Times New Roman" w:eastAsia="Times New Roman" w:hAnsi="Times New Roman" w:cs="Times New Roman"/>
@@ -9129,7 +9190,7 @@
           <w:lang w:val="es-ES"/>
         </w:rPr>
       </w:pPr>
-      <w:bookmarkStart w:id="28" w:name="_Toc243330816"/>
+      <w:bookmarkStart w:id="28" w:name="_Toc243332190"/>
       <w:r>
         <w:rPr>
           <w:rFonts w:ascii="Times New Roman" w:eastAsia="Times New Roman" w:hAnsi="Times New Roman" w:cs="Times New Roman"/>
@@ -9327,7 +9388,7 @@
           <w:lang w:val="es-ES"/>
         </w:rPr>
       </w:pPr>
-      <w:bookmarkStart w:id="29" w:name="_Toc243330817"/>
+      <w:bookmarkStart w:id="29" w:name="_Toc243332191"/>
       <w:r>
         <w:rPr>
           <w:rFonts w:ascii="Times New Roman" w:eastAsia="Times New Roman" w:hAnsi="Times New Roman" w:cs="Times New Roman"/>
@@ -9391,7 +9452,7 @@
       </w:r>
     </w:p>
     <w:sectPr>
-      <w:headerReference w:type="default" r:id="rId15"/>
+      <w:headerReference w:type="default" r:id="rId16"/>
       <w:pgSz w:w="12240" w:h="15840"/>
       <w:pgMar w:top="1440" w:right="1440" w:bottom="1440" w:left="1440" w:header="720" w:footer="720" w:gutter="0"/>
       <w:cols w:space="720"/>

</xml_diff>